<commit_message>
Add Key Decision Made
Add 2. Key Decision Made to file ‏‏IT363 - Mid-Project Progress Report.docx
</commit_message>
<xml_diff>
--- a/‏‏IT363 - Mid-Project Progress Report.docx
+++ b/‏‏IT363 - Mid-Project Progress Report.docx
@@ -1313,7 +1313,11 @@
               </mc:Choice>
               <mc:Fallback>
                 <w:pict>
-                  <v:shape w14:anchorId="7CBAAF0B" id="Text Box 15" o:spid="_x0000_s1028" type="#_x0000_t202" alt="contact info" style="position:absolute;left:0;text-align:left;margin-left:36.35pt;margin-top:237.75pt;width:540pt;height:115.1pt;z-index:251675648;visibility:visible;mso-wrap-style:square;mso-width-percent:1282;mso-height-percent:0;mso-wrap-distance-left:9pt;mso-wrap-distance-top:0;mso-wrap-distance-right:9pt;mso-wrap-distance-bottom:0;mso-position-horizontal:absolute;mso-position-horizontal-relative:page;mso-position-vertical:absolute;mso-position-vertical-relative:margin;mso-width-percent:1282;mso-height-percent:0;mso-width-relative:margin;mso-height-relative:margin;v-text-anchor:bottom" o:gfxdata="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" o:allowoverlap="f" filled="f" stroked="f" strokeweight=".5pt">
+                  <v:shapetype w14:anchorId="7CBAAF0B" id="_x0000_t202" coordsize="21600,21600" o:spt="202" path="m,l,21600r21600,l21600,xe">
+                    <v:stroke joinstyle="miter"/>
+                    <v:path gradientshapeok="t" o:connecttype="rect"/>
+                  </v:shapetype>
+                  <v:shape id="Text Box 15" o:spid="_x0000_s1028" type="#_x0000_t202" alt="contact info" style="position:absolute;left:0;text-align:left;margin-left:36.35pt;margin-top:237.75pt;width:540pt;height:115.1pt;z-index:251675648;visibility:visible;mso-wrap-style:square;mso-width-percent:1282;mso-height-percent:0;mso-wrap-distance-left:9pt;mso-wrap-distance-top:0;mso-wrap-distance-right:9pt;mso-wrap-distance-bottom:0;mso-position-horizontal:absolute;mso-position-horizontal-relative:page;mso-position-vertical:absolute;mso-position-vertical-relative:margin;mso-width-percent:1282;mso-height-percent:0;mso-width-relative:margin;mso-height-relative:margin;v-text-anchor:bottom" o:gfxdata="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" o:allowoverlap="f" filled="f" stroked="f" strokeweight=".5pt">
                     <v:textbox inset="0,0,0,0">
                       <w:txbxContent>
                         <w:p>
@@ -5381,6 +5385,126 @@
         <w:t>A brief explanation was provided for each parameter to show how it can affect the performance and reliability of the lab network.</w:t>
       </w:r>
     </w:p>
+    <w:p>
+      <w:pPr>
+        <w:pStyle w:val="Style1"/>
+        <w:spacing w:after="240" w:line="360" w:lineRule="auto"/>
+        <w:ind w:left="630"/>
+        <w:jc w:val="both"/>
+        <w:rPr>
+          <w:rFonts w:eastAsia="Times New Roman"/>
+          <w:color w:val="002060"/>
+          <w:sz w:val="16"/>
+          <w:szCs w:val="16"/>
+          <w:lang w:eastAsia="en-US"/>
+        </w:rPr>
+      </w:pPr>
+    </w:p>
+    <w:p>
+      <w:pPr>
+        <w:pStyle w:val="Style1"/>
+        <w:numPr>
+          <w:ilvl w:val="0"/>
+          <w:numId w:val="45"/>
+        </w:numPr>
+        <w:spacing w:after="240" w:line="360" w:lineRule="auto"/>
+        <w:ind w:left="360" w:hanging="270"/>
+        <w:jc w:val="both"/>
+        <w:rPr>
+          <w:bCs w:val="0"/>
+          <w:color w:val="C00000"/>
+        </w:rPr>
+      </w:pPr>
+      <w:r>
+        <w:rPr>
+          <w:bCs w:val="0"/>
+          <w:color w:val="C00000"/>
+        </w:rPr>
+        <w:t>Key Decision Made</w:t>
+      </w:r>
+      <w:r>
+        <w:rPr>
+          <w:bCs w:val="0"/>
+          <w:color w:val="C00000"/>
+        </w:rPr>
+        <w:t>:</w:t>
+      </w:r>
+    </w:p>
+    <w:p>
+      <w:pPr>
+        <w:pStyle w:val="Style1"/>
+        <w:spacing w:after="240" w:line="360" w:lineRule="auto"/>
+        <w:ind w:left="360"/>
+        <w:jc w:val="both"/>
+        <w:rPr>
+          <w:bCs w:val="0"/>
+          <w:color w:val="002060"/>
+        </w:rPr>
+      </w:pPr>
+      <w:r>
+        <w:rPr>
+          <w:bCs w:val="0"/>
+          <w:color w:val="002060"/>
+        </w:rPr>
+        <w:t xml:space="preserve">During this period, our group selected an official </w:t>
+      </w:r>
+      <w:r>
+        <w:rPr>
+          <w:b/>
+          <w:bCs w:val="0"/>
+          <w:color w:val="002060"/>
+        </w:rPr>
+        <w:t>group coordinator</w:t>
+      </w:r>
+      <w:r>
+        <w:rPr>
+          <w:bCs w:val="0"/>
+          <w:color w:val="002060"/>
+        </w:rPr>
+        <w:t xml:space="preserve"> to manage the final submission process. The coordinator will ensure that both the </w:t>
+      </w:r>
+      <w:r>
+        <w:rPr>
+          <w:b/>
+          <w:bCs w:val="0"/>
+          <w:color w:val="002060"/>
+        </w:rPr>
+        <w:t>Word and PDF files</w:t>
+      </w:r>
+      <w:r>
+        <w:rPr>
+          <w:bCs w:val="0"/>
+          <w:color w:val="002060"/>
+        </w:rPr>
+        <w:t xml:space="preserve"> are submitted through the assigned folder on </w:t>
+      </w:r>
+      <w:r>
+        <w:rPr>
+          <w:b/>
+          <w:bCs w:val="0"/>
+          <w:color w:val="002060"/>
+        </w:rPr>
+        <w:t>Blackboard</w:t>
+      </w:r>
+      <w:r>
+        <w:rPr>
+          <w:bCs w:val="0"/>
+          <w:color w:val="002060"/>
+        </w:rPr>
+        <w:t>. We also agreed not to use compressed file formats because they may cause submission problems.</w:t>
+      </w:r>
+    </w:p>
+    <w:p>
+      <w:pPr>
+        <w:pStyle w:val="Style1"/>
+        <w:spacing w:after="240" w:line="360" w:lineRule="auto"/>
+        <w:jc w:val="both"/>
+        <w:rPr>
+          <w:bCs w:val="0"/>
+          <w:color w:val="002060"/>
+        </w:rPr>
+      </w:pPr>
+    </w:p>
     <w:sectPr>
       <w:headerReference w:type="default" r:id="rId15"/>
       <w:footerReference w:type="even" r:id="rId16"/>
@@ -13224,10 +13348,8 @@
     <w:rsid w:val="00324ACF"/>
     <w:rsid w:val="00351A43"/>
     <w:rsid w:val="00354BA8"/>
-    <w:rsid w:val="00360604"/>
     <w:rsid w:val="004A7EE6"/>
     <w:rsid w:val="004C22D9"/>
-    <w:rsid w:val="00516D1C"/>
     <w:rsid w:val="005443A0"/>
     <w:rsid w:val="005471BA"/>
     <w:rsid w:val="005E024E"/>
@@ -13260,7 +13382,9 @@
     <w:rsid w:val="00C77297"/>
     <w:rsid w:val="00CC6F9F"/>
     <w:rsid w:val="00D248BA"/>
+    <w:rsid w:val="00D5092F"/>
     <w:rsid w:val="00D56FB7"/>
+    <w:rsid w:val="00D93527"/>
     <w:rsid w:val="00E552F8"/>
     <w:rsid w:val="00E97C42"/>
     <w:rsid w:val="00EA7B1C"/>
@@ -14091,16 +14215,16 @@
 </file>
 
 <file path=customXml/item2.xml><?xml version="1.0" encoding="utf-8"?>
+<b:Sources xmlns:b="http://schemas.openxmlformats.org/officeDocument/2006/bibliography" SelectedStyle="\APA.XSL" StyleName="APA"/>
+</file>
+
+<file path=customXml/item3.xml><?xml version="1.0" encoding="utf-8"?>
 <?mso-contentType ?>
 <FormTemplates xmlns="http://schemas.microsoft.com/sharepoint/v3/contenttype/forms">
   <Display>DocumentLibraryForm</Display>
   <Edit>AssetEditForm</Edit>
   <New>DocumentLibraryForm</New>
 </FormTemplates>
-</file>
-
-<file path=customXml/item3.xml><?xml version="1.0" encoding="utf-8"?>
-<b:Sources xmlns:b="http://schemas.openxmlformats.org/officeDocument/2006/bibliography" SelectedStyle="\APA.XSL" StyleName="APA"/>
 </file>
 
 <file path=customXml/itemProps1.xml><?xml version="1.0" encoding="utf-8"?>
@@ -14112,17 +14236,17 @@
 </file>
 
 <file path=customXml/itemProps2.xml><?xml version="1.0" encoding="utf-8"?>
+<ds:datastoreItem xmlns:ds="http://schemas.openxmlformats.org/officeDocument/2006/customXml" ds:itemID="{355C5113-D031-41DB-A6D8-43CE1A0E6695}">
+  <ds:schemaRefs>
+    <ds:schemaRef ds:uri="http://schemas.openxmlformats.org/officeDocument/2006/bibliography"/>
+  </ds:schemaRefs>
+</ds:datastoreItem>
+</file>
+
+<file path=customXml/itemProps3.xml><?xml version="1.0" encoding="utf-8"?>
 <ds:datastoreItem xmlns:ds="http://schemas.openxmlformats.org/officeDocument/2006/customXml" ds:itemID="{E34C63B7-A026-4A37-9535-4FBB4C03A11D}">
   <ds:schemaRefs>
     <ds:schemaRef ds:uri="http://schemas.microsoft.com/sharepoint/v3/contenttype/forms"/>
   </ds:schemaRefs>
 </ds:datastoreItem>
-</file>
-
-<file path=customXml/itemProps3.xml><?xml version="1.0" encoding="utf-8"?>
-<ds:datastoreItem xmlns:ds="http://schemas.openxmlformats.org/officeDocument/2006/customXml" ds:itemID="{355C5113-D031-41DB-A6D8-43CE1A0E6695}">
-  <ds:schemaRefs>
-    <ds:schemaRef ds:uri="http://schemas.openxmlformats.org/officeDocument/2006/bibliography"/>
-  </ds:schemaRefs>
-</ds:datastoreItem>
 </file>
</xml_diff>

<commit_message>
Add One Problem Encountered
Add One Problem Encountered to ‏‏IT363 - Mid-Project Progress Report.docx
</commit_message>
<xml_diff>
--- a/‏‏IT363 - Mid-Project Progress Report.docx
+++ b/‏‏IT363 - Mid-Project Progress Report.docx
@@ -1313,11 +1313,7 @@
               </mc:Choice>
               <mc:Fallback>
                 <w:pict>
-                  <v:shapetype w14:anchorId="7CBAAF0B" id="_x0000_t202" coordsize="21600,21600" o:spt="202" path="m,l,21600r21600,l21600,xe">
-                    <v:stroke joinstyle="miter"/>
-                    <v:path gradientshapeok="t" o:connecttype="rect"/>
-                  </v:shapetype>
-                  <v:shape id="Text Box 15" o:spid="_x0000_s1028" type="#_x0000_t202" alt="contact info" style="position:absolute;left:0;text-align:left;margin-left:36.35pt;margin-top:237.75pt;width:540pt;height:115.1pt;z-index:251675648;visibility:visible;mso-wrap-style:square;mso-width-percent:1282;mso-height-percent:0;mso-wrap-distance-left:9pt;mso-wrap-distance-top:0;mso-wrap-distance-right:9pt;mso-wrap-distance-bottom:0;mso-position-horizontal:absolute;mso-position-horizontal-relative:page;mso-position-vertical:absolute;mso-position-vertical-relative:margin;mso-width-percent:1282;mso-height-percent:0;mso-width-relative:margin;mso-height-relative:margin;v-text-anchor:bottom" o:gfxdata="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" o:allowoverlap="f" filled="f" stroked="f" strokeweight=".5pt">
+                  <v:shape w14:anchorId="7CBAAF0B" id="Text Box 15" o:spid="_x0000_s1028" type="#_x0000_t202" alt="contact info" style="position:absolute;left:0;text-align:left;margin-left:36.35pt;margin-top:237.75pt;width:540pt;height:115.1pt;z-index:251675648;visibility:visible;mso-wrap-style:square;mso-width-percent:1282;mso-height-percent:0;mso-wrap-distance-left:9pt;mso-wrap-distance-top:0;mso-wrap-distance-right:9pt;mso-wrap-distance-bottom:0;mso-position-horizontal:absolute;mso-position-horizontal-relative:page;mso-position-vertical:absolute;mso-position-vertical-relative:margin;mso-width-percent:1282;mso-height-percent:0;mso-width-relative:margin;mso-height-relative:margin;v-text-anchor:bottom" o:gfxdata="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" o:allowoverlap="f" filled="f" stroked="f" strokeweight=".5pt">
                     <v:textbox inset="0,0,0,0">
                       <w:txbxContent>
                         <w:p>
@@ -5498,12 +5494,132 @@
       <w:pPr>
         <w:pStyle w:val="Style1"/>
         <w:spacing w:after="240" w:line="360" w:lineRule="auto"/>
+        <w:ind w:left="360"/>
         <w:jc w:val="both"/>
         <w:rPr>
           <w:bCs w:val="0"/>
           <w:color w:val="002060"/>
         </w:rPr>
       </w:pPr>
+    </w:p>
+    <w:p>
+      <w:pPr>
+        <w:pStyle w:val="Style1"/>
+        <w:numPr>
+          <w:ilvl w:val="0"/>
+          <w:numId w:val="45"/>
+        </w:numPr>
+        <w:spacing w:after="240" w:line="360" w:lineRule="auto"/>
+        <w:ind w:left="360" w:hanging="270"/>
+        <w:jc w:val="both"/>
+        <w:rPr>
+          <w:bCs w:val="0"/>
+          <w:color w:val="C00000"/>
+        </w:rPr>
+      </w:pPr>
+      <w:r>
+        <w:rPr>
+          <w:bCs w:val="0"/>
+          <w:color w:val="C00000"/>
+        </w:rPr>
+        <w:lastRenderedPageBreak/>
+        <w:t>One Problem Encountered</w:t>
+      </w:r>
+      <w:r>
+        <w:rPr>
+          <w:bCs w:val="0"/>
+          <w:color w:val="C00000"/>
+        </w:rPr>
+        <w:t>:</w:t>
+      </w:r>
+    </w:p>
+    <w:p>
+      <w:pPr>
+        <w:pStyle w:val="Style1"/>
+        <w:numPr>
+          <w:ilvl w:val="0"/>
+          <w:numId w:val="47"/>
+        </w:numPr>
+        <w:spacing w:after="240" w:line="360" w:lineRule="auto"/>
+        <w:ind w:left="540" w:hanging="180"/>
+        <w:jc w:val="both"/>
+        <w:rPr>
+          <w:bCs w:val="0"/>
+          <w:color w:val="C00000"/>
+        </w:rPr>
+      </w:pPr>
+      <w:r>
+        <w:rPr>
+          <w:color w:val="002060"/>
+        </w:rPr>
+        <w:t>At the beginning, the group faced difficulty finding a suitable time for all members to work together because each member had a different schedule.</w:t>
+      </w:r>
+    </w:p>
+    <w:p>
+      <w:pPr>
+        <w:pStyle w:val="Style1"/>
+        <w:numPr>
+          <w:ilvl w:val="0"/>
+          <w:numId w:val="47"/>
+        </w:numPr>
+        <w:spacing w:after="240" w:line="360" w:lineRule="auto"/>
+        <w:ind w:left="540" w:hanging="180"/>
+        <w:jc w:val="both"/>
+        <w:rPr>
+          <w:bCs w:val="0"/>
+          <w:color w:val="C00000"/>
+        </w:rPr>
+      </w:pPr>
+      <w:r>
+        <w:rPr>
+          <w:color w:val="002060"/>
+        </w:rPr>
+        <w:t>To solve this problem, we divided the project tasks between the group members.</w:t>
+      </w:r>
+    </w:p>
+    <w:p>
+      <w:pPr>
+        <w:pStyle w:val="Style1"/>
+        <w:numPr>
+          <w:ilvl w:val="0"/>
+          <w:numId w:val="47"/>
+        </w:numPr>
+        <w:spacing w:after="240" w:line="360" w:lineRule="auto"/>
+        <w:ind w:left="540" w:hanging="180"/>
+        <w:jc w:val="both"/>
+        <w:rPr>
+          <w:bCs w:val="0"/>
+          <w:color w:val="C00000"/>
+        </w:rPr>
+      </w:pPr>
+      <w:r>
+        <w:rPr>
+          <w:color w:val="002060"/>
+        </w:rPr>
+        <w:t>Each student worked on the assigned task individually and shared the completed work with the rest of the group.</w:t>
+      </w:r>
+    </w:p>
+    <w:p>
+      <w:pPr>
+        <w:pStyle w:val="Style1"/>
+        <w:numPr>
+          <w:ilvl w:val="0"/>
+          <w:numId w:val="47"/>
+        </w:numPr>
+        <w:spacing w:after="240" w:line="360" w:lineRule="auto"/>
+        <w:ind w:left="540" w:hanging="180"/>
+        <w:jc w:val="both"/>
+        <w:rPr>
+          <w:bCs w:val="0"/>
+          <w:color w:val="C00000"/>
+        </w:rPr>
+      </w:pPr>
+      <w:r>
+        <w:rPr>
+          <w:color w:val="002060"/>
+        </w:rPr>
+        <w:t>This method allowed all members to participate without needing to be online at the same time.</w:t>
+      </w:r>
     </w:p>
     <w:sectPr>
       <w:headerReference w:type="default" r:id="rId15"/>
@@ -13340,11 +13456,13 @@
     <w:rsidRoot w:val="00324ACF"/>
     <w:rsid w:val="00051231"/>
     <w:rsid w:val="00085FAA"/>
+    <w:rsid w:val="000B418D"/>
     <w:rsid w:val="000F3543"/>
     <w:rsid w:val="0010587C"/>
     <w:rsid w:val="00156526"/>
     <w:rsid w:val="001A632E"/>
     <w:rsid w:val="00200AE2"/>
+    <w:rsid w:val="002F1816"/>
     <w:rsid w:val="00324ACF"/>
     <w:rsid w:val="00351A43"/>
     <w:rsid w:val="00354BA8"/>
@@ -13382,9 +13500,7 @@
     <w:rsid w:val="00C77297"/>
     <w:rsid w:val="00CC6F9F"/>
     <w:rsid w:val="00D248BA"/>
-    <w:rsid w:val="00D5092F"/>
     <w:rsid w:val="00D56FB7"/>
-    <w:rsid w:val="00D93527"/>
     <w:rsid w:val="00E552F8"/>
     <w:rsid w:val="00E97C42"/>
     <w:rsid w:val="00EA7B1C"/>
@@ -14215,16 +14331,16 @@
 </file>
 
 <file path=customXml/item2.xml><?xml version="1.0" encoding="utf-8"?>
-<b:Sources xmlns:b="http://schemas.openxmlformats.org/officeDocument/2006/bibliography" SelectedStyle="\APA.XSL" StyleName="APA"/>
-</file>
-
-<file path=customXml/item3.xml><?xml version="1.0" encoding="utf-8"?>
 <?mso-contentType ?>
 <FormTemplates xmlns="http://schemas.microsoft.com/sharepoint/v3/contenttype/forms">
   <Display>DocumentLibraryForm</Display>
   <Edit>AssetEditForm</Edit>
   <New>DocumentLibraryForm</New>
 </FormTemplates>
+</file>
+
+<file path=customXml/item3.xml><?xml version="1.0" encoding="utf-8"?>
+<b:Sources xmlns:b="http://schemas.openxmlformats.org/officeDocument/2006/bibliography" SelectedStyle="\APA.XSL" StyleName="APA"/>
 </file>
 
 <file path=customXml/itemProps1.xml><?xml version="1.0" encoding="utf-8"?>
@@ -14236,17 +14352,17 @@
 </file>
 
 <file path=customXml/itemProps2.xml><?xml version="1.0" encoding="utf-8"?>
+<ds:datastoreItem xmlns:ds="http://schemas.openxmlformats.org/officeDocument/2006/customXml" ds:itemID="{E34C63B7-A026-4A37-9535-4FBB4C03A11D}">
+  <ds:schemaRefs>
+    <ds:schemaRef ds:uri="http://schemas.microsoft.com/sharepoint/v3/contenttype/forms"/>
+  </ds:schemaRefs>
+</ds:datastoreItem>
+</file>
+
+<file path=customXml/itemProps3.xml><?xml version="1.0" encoding="utf-8"?>
 <ds:datastoreItem xmlns:ds="http://schemas.openxmlformats.org/officeDocument/2006/customXml" ds:itemID="{355C5113-D031-41DB-A6D8-43CE1A0E6695}">
   <ds:schemaRefs>
     <ds:schemaRef ds:uri="http://schemas.openxmlformats.org/officeDocument/2006/bibliography"/>
   </ds:schemaRefs>
 </ds:datastoreItem>
-</file>
-
-<file path=customXml/itemProps3.xml><?xml version="1.0" encoding="utf-8"?>
-<ds:datastoreItem xmlns:ds="http://schemas.openxmlformats.org/officeDocument/2006/customXml" ds:itemID="{E34C63B7-A026-4A37-9535-4FBB4C03A11D}">
-  <ds:schemaRefs>
-    <ds:schemaRef ds:uri="http://schemas.microsoft.com/sharepoint/v3/contenttype/forms"/>
-  </ds:schemaRefs>
-</ds:datastoreItem>
 </file>
</xml_diff>

<commit_message>
Add 4. Plan for the Next Period
Add 4. Plan for the Next Period to ‏‏IT363 - Mid-Project Progress Report.docx file
</commit_message>
<xml_diff>
--- a/‏‏IT363 - Mid-Project Progress Report.docx
+++ b/‏‏IT363 - Mid-Project Progress Report.docx
@@ -5621,6 +5621,225 @@
         <w:t>This method allowed all members to participate without needing to be online at the same time.</w:t>
       </w:r>
     </w:p>
+    <w:p>
+      <w:pPr>
+        <w:pStyle w:val="Style1"/>
+        <w:spacing w:after="240" w:line="360" w:lineRule="auto"/>
+        <w:ind w:left="540"/>
+        <w:jc w:val="both"/>
+        <w:rPr>
+          <w:bCs w:val="0"/>
+          <w:color w:val="C00000"/>
+          <w:sz w:val="16"/>
+          <w:szCs w:val="22"/>
+        </w:rPr>
+      </w:pPr>
+    </w:p>
+    <w:p>
+      <w:pPr>
+        <w:pStyle w:val="Style1"/>
+        <w:numPr>
+          <w:ilvl w:val="0"/>
+          <w:numId w:val="45"/>
+        </w:numPr>
+        <w:spacing w:after="240" w:line="360" w:lineRule="auto"/>
+        <w:ind w:left="360" w:hanging="270"/>
+        <w:jc w:val="both"/>
+        <w:rPr>
+          <w:bCs w:val="0"/>
+          <w:color w:val="C00000"/>
+        </w:rPr>
+      </w:pPr>
+      <w:r>
+        <w:rPr>
+          <w:bCs w:val="0"/>
+          <w:color w:val="C00000"/>
+        </w:rPr>
+        <w:t>Plan for the Next Period</w:t>
+      </w:r>
+      <w:r>
+        <w:rPr>
+          <w:bCs w:val="0"/>
+          <w:color w:val="C00000"/>
+        </w:rPr>
+        <w:t>:</w:t>
+      </w:r>
+    </w:p>
+    <w:p>
+      <w:pPr>
+        <w:pStyle w:val="Style1"/>
+        <w:numPr>
+          <w:ilvl w:val="0"/>
+          <w:numId w:val="49"/>
+        </w:numPr>
+        <w:spacing w:after="240" w:line="360" w:lineRule="auto"/>
+        <w:ind w:left="540" w:hanging="180"/>
+        <w:jc w:val="both"/>
+        <w:rPr>
+          <w:bCs w:val="0"/>
+          <w:color w:val="C00000"/>
+        </w:rPr>
+      </w:pPr>
+      <w:r>
+        <w:rPr>
+          <w:color w:val="002060"/>
+        </w:rPr>
+        <w:t xml:space="preserve">In the next period, we will start working on </w:t>
+      </w:r>
+      <w:r>
+        <w:rPr>
+          <w:b/>
+          <w:color w:val="002060"/>
+        </w:rPr>
+        <w:t>Question 2</w:t>
+      </w:r>
+      <w:r>
+        <w:rPr>
+          <w:color w:val="002060"/>
+        </w:rPr>
+        <w:t>.</w:t>
+      </w:r>
+    </w:p>
+    <w:p>
+      <w:pPr>
+        <w:pStyle w:val="Style1"/>
+        <w:numPr>
+          <w:ilvl w:val="0"/>
+          <w:numId w:val="49"/>
+        </w:numPr>
+        <w:spacing w:after="240" w:line="360" w:lineRule="auto"/>
+        <w:ind w:left="540" w:hanging="180"/>
+        <w:jc w:val="both"/>
+        <w:rPr>
+          <w:bCs w:val="0"/>
+          <w:color w:val="C00000"/>
+        </w:rPr>
+      </w:pPr>
+      <w:r>
+        <w:rPr>
+          <w:color w:val="002060"/>
+        </w:rPr>
+        <w:t xml:space="preserve">We will compare the </w:t>
+      </w:r>
+      <w:r>
+        <w:rPr>
+          <w:b/>
+          <w:color w:val="002060"/>
+        </w:rPr>
+        <w:t>OSI/CMIP, SNMP/Internet, and TMN</w:t>
+      </w:r>
+      <w:r>
+        <w:rPr>
+          <w:color w:val="002060"/>
+        </w:rPr>
+        <w:t xml:space="preserve"> network management standards.</w:t>
+      </w:r>
+    </w:p>
+    <w:p>
+      <w:pPr>
+        <w:pStyle w:val="Style1"/>
+        <w:numPr>
+          <w:ilvl w:val="0"/>
+          <w:numId w:val="49"/>
+        </w:numPr>
+        <w:spacing w:after="240" w:line="360" w:lineRule="auto"/>
+        <w:ind w:left="540" w:hanging="180"/>
+        <w:jc w:val="both"/>
+        <w:rPr>
+          <w:bCs w:val="0"/>
+          <w:color w:val="C00000"/>
+        </w:rPr>
+      </w:pPr>
+      <w:r>
+        <w:rPr>
+          <w:color w:val="002060"/>
+        </w:rPr>
+        <w:t xml:space="preserve">We will explain why </w:t>
+      </w:r>
+      <w:r>
+        <w:rPr>
+          <w:b/>
+          <w:color w:val="002060"/>
+        </w:rPr>
+        <w:t>SNMP</w:t>
+      </w:r>
+      <w:r>
+        <w:rPr>
+          <w:color w:val="002060"/>
+        </w:rPr>
+        <w:t xml:space="preserve"> is commonly used in practical network management.</w:t>
+      </w:r>
+    </w:p>
+    <w:p>
+      <w:pPr>
+        <w:pStyle w:val="Style1"/>
+        <w:numPr>
+          <w:ilvl w:val="0"/>
+          <w:numId w:val="49"/>
+        </w:numPr>
+        <w:spacing w:after="240" w:line="360" w:lineRule="auto"/>
+        <w:ind w:left="540" w:hanging="180"/>
+        <w:jc w:val="both"/>
+        <w:rPr>
+          <w:bCs w:val="0"/>
+          <w:color w:val="C00000"/>
+        </w:rPr>
+      </w:pPr>
+      <w:r>
+        <w:rPr>
+          <w:color w:val="002060"/>
+        </w:rPr>
+        <w:t xml:space="preserve">We will also describe the </w:t>
+      </w:r>
+      <w:r>
+        <w:rPr>
+          <w:b/>
+          <w:color w:val="002060"/>
+        </w:rPr>
+        <w:t>organizational, information, communication, and functional management models</w:t>
+      </w:r>
+      <w:r>
+        <w:rPr>
+          <w:color w:val="002060"/>
+        </w:rPr>
+        <w:t>.</w:t>
+      </w:r>
+    </w:p>
+    <w:p>
+      <w:pPr>
+        <w:pStyle w:val="Style1"/>
+        <w:numPr>
+          <w:ilvl w:val="0"/>
+          <w:numId w:val="49"/>
+        </w:numPr>
+        <w:spacing w:after="240" w:line="360" w:lineRule="auto"/>
+        <w:ind w:left="540" w:hanging="180"/>
+        <w:jc w:val="both"/>
+        <w:rPr>
+          <w:bCs w:val="0"/>
+          <w:color w:val="C00000"/>
+        </w:rPr>
+      </w:pPr>
+      <w:r>
+        <w:rPr>
+          <w:color w:val="002060"/>
+        </w:rPr>
+        <w:t xml:space="preserve">Our goal is to complete these tasks before the </w:t>
+      </w:r>
+      <w:r>
+        <w:rPr>
+          <w:b/>
+          <w:color w:val="002060"/>
+        </w:rPr>
+        <w:t>Phase 1 deadline</w:t>
+      </w:r>
+      <w:r>
+        <w:rPr>
+          <w:color w:val="002060"/>
+        </w:rPr>
+        <w:t xml:space="preserve"> so that the group has enough time to review and improve the report.</w:t>
+      </w:r>
+    </w:p>
     <w:sectPr>
       <w:headerReference w:type="default" r:id="rId15"/>
       <w:footerReference w:type="even" r:id="rId16"/>
@@ -13456,13 +13675,12 @@
     <w:rsidRoot w:val="00324ACF"/>
     <w:rsid w:val="00051231"/>
     <w:rsid w:val="00085FAA"/>
-    <w:rsid w:val="000B418D"/>
     <w:rsid w:val="000F3543"/>
     <w:rsid w:val="0010587C"/>
     <w:rsid w:val="00156526"/>
     <w:rsid w:val="001A632E"/>
     <w:rsid w:val="00200AE2"/>
-    <w:rsid w:val="002F1816"/>
+    <w:rsid w:val="00263FEC"/>
     <w:rsid w:val="00324ACF"/>
     <w:rsid w:val="00351A43"/>
     <w:rsid w:val="00354BA8"/>
@@ -13476,6 +13694,7 @@
     <w:rsid w:val="00683298"/>
     <w:rsid w:val="00695677"/>
     <w:rsid w:val="0075317F"/>
+    <w:rsid w:val="007C17EB"/>
     <w:rsid w:val="007F01C2"/>
     <w:rsid w:val="00814B81"/>
     <w:rsid w:val="008456E9"/>

</xml_diff>